<commit_message>
Yayın: elektrik pozları birim fiyat serisine (35.xxx) alındı
Uygun harcama 15.753.004,18 TL = 298.587 Avro; eşiğe kalan pay 1.413 Avro.

Co-Authored-By: Claude Opus 5 <noreply@anthropic.com>
Claude-Session: https://claude.ai/code/session_01HJPp6bx7wepUX5p8fxGcjg
</commit_message>
<xml_diff>
--- a/belgeler/08_IPARD_EVRAK_LISTESI.docx
+++ b/belgeler/08_IPARD_EVRAK_LISTESI.docx
@@ -913,7 +913,7 @@
                 <w:color w:val="000000"/>
                 <w:sz w:val="16"/>
               </w:rPr>
-              <w:t xml:space="preserve">; hibeye konu tutar her zaman KDV hariç tutardır. Müstahsil olarak KDV mükellefi olmadığınız için bu KDV'yi indirim yoluyla geri de alamazsınız — tamamı cepten çıkar. Banka niyet mektubunun (A10) kapsaması gereken tutar budur: ·  · Yapım işleri (KDV hariç) · 15.774.454,50 TL · Makine ve ekipman (KDV hariç) · 2.885.847,21 TL · </w:t>
+              <w:t xml:space="preserve">; hibeye konu tutar her zaman KDV hariç tutardır. Müstahsil olarak KDV mükellefi olmadığınız için bu KDV'yi indirim yoluyla geri de alamazsınız — tamamı cepten çıkar. Banka niyet mektubunun (A10) kapsaması gereken tutar budur: ·  · Yapım işleri (KDV hariç) · 15.753.004,18 TL · Makine ve ekipman (KDV hariç) · 2.885.847,21 TL · </w:t>
             </w:r>
             <w:r>
               <w:rPr>
@@ -943,7 +943,7 @@
                 <w:color w:val="000000"/>
                 <w:sz w:val="16"/>
               </w:rPr>
-              <w:t>18.660.301,71 TL</w:t>
+              <w:t>18.638.851,39 TL</w:t>
             </w:r>
             <w:r>
               <w:rPr>
@@ -953,7 +953,7 @@
                 <w:color w:val="000000"/>
                 <w:sz w:val="16"/>
               </w:rPr>
-              <w:t xml:space="preserve"> · KDV %20 — hibe dışı, tamamı öz kaynak · 3.732.060,34 TL · </w:t>
+              <w:t xml:space="preserve"> · KDV %20 — hibe dışı, tamamı öz kaynak · 3.727.770,28 TL · </w:t>
             </w:r>
             <w:r>
               <w:rPr>
@@ -983,7 +983,7 @@
                 <w:color w:val="000000"/>
                 <w:sz w:val="16"/>
               </w:rPr>
-              <w:t>22.392.362,05 TL</w:t>
+              <w:t>22.366.621,67 TL</w:t>
             </w:r>
           </w:p>
         </w:tc>
@@ -4286,7 +4286,7 @@
                 <w:color w:val="000000"/>
                 <w:sz w:val="16"/>
               </w:rPr>
-              <w:t>Detaylı metraj cetveli · 03_METRAJ_CETVELI.pdf — yapı bazında, 156 ölçü satırı.</w:t>
+              <w:t>Detaylı metraj cetveli · 03_METRAJ_CETVELI.pdf — yapı bazında, 161 ölçü satırı.</w:t>
             </w:r>
           </w:p>
         </w:tc>
@@ -4452,7 +4452,7 @@
                 <w:color w:val="000000"/>
                 <w:sz w:val="16"/>
               </w:rPr>
-              <w:t>Keşif özeti · 27_KESIF_OZETI_EK_01_KUMES_A_BLOK.pdf ve diğer yapı nüshaları — her münferit yapı için AYRI düzenlenir, EK-1 uygun harcama kalemlerine göre gruplu; hibe kapsamındaki iki blokta 86 satır.</w:t>
+              <w:t>Keşif özeti · 27_KESIF_OZETI_EK_01_KUMES_A_BLOK.pdf ve diğer yapı nüshaları — her münferit yapı için AYRI düzenlenir, EK-1 uygun harcama kalemlerine göre gruplu; hibe kapsamındaki iki blokta 96 satır.</w:t>
             </w:r>
           </w:p>
         </w:tc>
@@ -4701,7 +4701,7 @@
                 <w:color w:val="000000"/>
                 <w:sz w:val="16"/>
               </w:rPr>
-              <w:t>Yaklaşık maliyet cetveli · 86 kalem, 156 ölçü satırı; bağımsız doğrulayıcıdan sapmasız geçiyor.</w:t>
+              <w:t>Yaklaşık maliyet cetveli · 91 kalem, 161 ölçü satırı; bağımsız doğrulayıcıdan sapmasız geçiyor.</w:t>
             </w:r>
           </w:p>
         </w:tc>

</xml_diff>

<commit_message>
Yayın: elektrik pozları 35.xxx serisine geçti, tutar korundu
Uygun harcama 15.774.454,50 TL = 298.994 Avro, eşiğe kalan pay 1.006 Avro.

Co-Authored-By: Claude Opus 5 <noreply@anthropic.com>
Claude-Session: https://claude.ai/code/session_01HJPp6bx7wepUX5p8fxGcjg
</commit_message>
<xml_diff>
--- a/belgeler/08_IPARD_EVRAK_LISTESI.docx
+++ b/belgeler/08_IPARD_EVRAK_LISTESI.docx
@@ -913,7 +913,7 @@
                 <w:color w:val="000000"/>
                 <w:sz w:val="16"/>
               </w:rPr>
-              <w:t xml:space="preserve">; hibeye konu tutar her zaman KDV hariç tutardır. Müstahsil olarak KDV mükellefi olmadığınız için bu KDV'yi indirim yoluyla geri de alamazsınız — tamamı cepten çıkar. Banka niyet mektubunun (A10) kapsaması gereken tutar budur: ·  · Yapım işleri (KDV hariç) · 15.753.004,18 TL · Makine ve ekipman (KDV hariç) · 2.885.847,21 TL · </w:t>
+              <w:t xml:space="preserve">; hibeye konu tutar her zaman KDV hariç tutardır. Müstahsil olarak KDV mükellefi olmadığınız için bu KDV'yi indirim yoluyla geri de alamazsınız — tamamı cepten çıkar. Banka niyet mektubunun (A10) kapsaması gereken tutar budur: ·  · Yapım işleri (KDV hariç) · 15.774.454,50 TL · Makine ve ekipman (KDV hariç) · 2.885.847,21 TL · </w:t>
             </w:r>
             <w:r>
               <w:rPr>
@@ -943,7 +943,7 @@
                 <w:color w:val="000000"/>
                 <w:sz w:val="16"/>
               </w:rPr>
-              <w:t>18.638.851,39 TL</w:t>
+              <w:t>18.660.301,71 TL</w:t>
             </w:r>
             <w:r>
               <w:rPr>
@@ -953,7 +953,7 @@
                 <w:color w:val="000000"/>
                 <w:sz w:val="16"/>
               </w:rPr>
-              <w:t xml:space="preserve"> · KDV %20 — hibe dışı, tamamı öz kaynak · 3.727.770,28 TL · </w:t>
+              <w:t xml:space="preserve"> · KDV %20 — hibe dışı, tamamı öz kaynak · 3.732.060,34 TL · </w:t>
             </w:r>
             <w:r>
               <w:rPr>
@@ -983,7 +983,7 @@
                 <w:color w:val="000000"/>
                 <w:sz w:val="16"/>
               </w:rPr>
-              <w:t>22.366.621,67 TL</w:t>
+              <w:t>22.392.362,05 TL</w:t>
             </w:r>
           </w:p>
         </w:tc>
@@ -4286,7 +4286,7 @@
                 <w:color w:val="000000"/>
                 <w:sz w:val="16"/>
               </w:rPr>
-              <w:t>Detaylı metraj cetveli · 03_METRAJ_CETVELI.pdf — yapı bazında, 161 ölçü satırı.</w:t>
+              <w:t>Detaylı metraj cetveli · 03_METRAJ_CETVELI.pdf — yapı bazında, 156 ölçü satırı.</w:t>
             </w:r>
           </w:p>
         </w:tc>
@@ -4452,7 +4452,7 @@
                 <w:color w:val="000000"/>
                 <w:sz w:val="16"/>
               </w:rPr>
-              <w:t>Keşif özeti · 27_KESIF_OZETI_EK_01_KUMES_A_BLOK.pdf ve diğer yapı nüshaları — her münferit yapı için AYRI düzenlenir, EK-1 uygun harcama kalemlerine göre gruplu; hibe kapsamındaki iki blokta 96 satır.</w:t>
+              <w:t>Keşif özeti · 27_KESIF_OZETI_EK_01_KUMES_A_BLOK.pdf ve diğer yapı nüshaları — her münferit yapı için AYRI düzenlenir, EK-1 uygun harcama kalemlerine göre gruplu; hibe kapsamındaki iki blokta 86 satır.</w:t>
             </w:r>
           </w:p>
         </w:tc>
@@ -4701,7 +4701,7 @@
                 <w:color w:val="000000"/>
                 <w:sz w:val="16"/>
               </w:rPr>
-              <w:t>Yaklaşık maliyet cetveli · 91 kalem, 161 ölçü satırı; bağımsız doğrulayıcıdan sapmasız geçiyor.</w:t>
+              <w:t>Yaklaşık maliyet cetveli · 86 kalem, 156 ölçü satırı; bağımsız doğrulayıcıdan sapmasız geçiyor.</w:t>
             </w:r>
           </w:p>
         </w:tc>

</xml_diff>

<commit_message>
Yayın: kablo tavası montaj satırları çıkarıldı
Uygun harcama 15.720.192,50 TL = 297.965 Avro; eşiğe kalan pay 2.035 Avro.

Co-Authored-By: Claude Opus 5 <noreply@anthropic.com>
Claude-Session: https://claude.ai/code/session_01HJPp6bx7wepUX5p8fxGcjg
</commit_message>
<xml_diff>
--- a/belgeler/08_IPARD_EVRAK_LISTESI.docx
+++ b/belgeler/08_IPARD_EVRAK_LISTESI.docx
@@ -913,7 +913,7 @@
                 <w:color w:val="000000"/>
                 <w:sz w:val="16"/>
               </w:rPr>
-              <w:t xml:space="preserve">; hibeye konu tutar her zaman KDV hariç tutardır. Müstahsil olarak KDV mükellefi olmadığınız için bu KDV'yi indirim yoluyla geri de alamazsınız — tamamı cepten çıkar. Banka niyet mektubunun (A10) kapsaması gereken tutar budur: ·  · Yapım işleri (KDV hariç) · 15.774.454,50 TL · Makine ve ekipman (KDV hariç) · 2.885.847,21 TL · </w:t>
+              <w:t xml:space="preserve">; hibeye konu tutar her zaman KDV hariç tutardır. Müstahsil olarak KDV mükellefi olmadığınız için bu KDV'yi indirim yoluyla geri de alamazsınız — tamamı cepten çıkar. Banka niyet mektubunun (A10) kapsaması gereken tutar budur: ·  · Yapım işleri (KDV hariç) · 15.720.192,50 TL · Makine ve ekipman (KDV hariç) · 2.885.847,21 TL · </w:t>
             </w:r>
             <w:r>
               <w:rPr>
@@ -943,7 +943,7 @@
                 <w:color w:val="000000"/>
                 <w:sz w:val="16"/>
               </w:rPr>
-              <w:t>18.660.301,71 TL</w:t>
+              <w:t>18.606.039,71 TL</w:t>
             </w:r>
             <w:r>
               <w:rPr>
@@ -953,7 +953,7 @@
                 <w:color w:val="000000"/>
                 <w:sz w:val="16"/>
               </w:rPr>
-              <w:t xml:space="preserve"> · KDV %20 — hibe dışı, tamamı öz kaynak · 3.732.060,34 TL · </w:t>
+              <w:t xml:space="preserve"> · KDV %20 — hibe dışı, tamamı öz kaynak · 3.721.207,94 TL · </w:t>
             </w:r>
             <w:r>
               <w:rPr>
@@ -983,7 +983,7 @@
                 <w:color w:val="000000"/>
                 <w:sz w:val="16"/>
               </w:rPr>
-              <w:t>22.392.362,05 TL</w:t>
+              <w:t>22.327.247,65 TL</w:t>
             </w:r>
           </w:p>
         </w:tc>
@@ -4286,7 +4286,7 @@
                 <w:color w:val="000000"/>
                 <w:sz w:val="16"/>
               </w:rPr>
-              <w:t>Detaylı metraj cetveli · 03_METRAJ_CETVELI.pdf — yapı bazında, 156 ölçü satırı.</w:t>
+              <w:t>Detaylı metraj cetveli · 03_METRAJ_CETVELI.pdf — yapı bazında, 154 ölçü satırı.</w:t>
             </w:r>
           </w:p>
         </w:tc>
@@ -4452,7 +4452,7 @@
                 <w:color w:val="000000"/>
                 <w:sz w:val="16"/>
               </w:rPr>
-              <w:t>Keşif özeti · 27_KESIF_OZETI_EK_01_KUMES_A_BLOK.pdf ve diğer yapı nüshaları — her münferit yapı için AYRI düzenlenir, EK-1 uygun harcama kalemlerine göre gruplu; hibe kapsamındaki iki blokta 86 satır.</w:t>
+              <w:t>Keşif özeti · 27_KESIF_OZETI_EK_01_KUMES_A_BLOK.pdf ve diğer yapı nüshaları — her münferit yapı için AYRI düzenlenir, EK-1 uygun harcama kalemlerine göre gruplu; hibe kapsamındaki iki blokta 82 satır.</w:t>
             </w:r>
           </w:p>
         </w:tc>
@@ -4701,7 +4701,7 @@
                 <w:color w:val="000000"/>
                 <w:sz w:val="16"/>
               </w:rPr>
-              <w:t>Yaklaşık maliyet cetveli · 86 kalem, 156 ölçü satırı; bağımsız doğrulayıcıdan sapmasız geçiyor.</w:t>
+              <w:t>Yaklaşık maliyet cetveli · 84 kalem, 154 ölçü satırı; bağımsız doğrulayıcıdan sapmasız geçiyor.</w:t>
             </w:r>
           </w:p>
         </w:tc>

</xml_diff>

<commit_message>
Yayın: beyan belgeleri TKDK başvuru ekranlarına eşitlendi (EKRAN-UYUMU)
Hibe dışı yapım işleri 5.867.052,75 -> 5.541.091,09 TL (ÖP-15 foseptik
tankı ve dokuz satırlık sıhhi tesisat beyan belgelerinden çıkarıldı),
makine-ekipman 3.784.288,46 -> 3.784.288,48 TL (ekrandaki miktar
bölünmesi işlendi). Uygun harcama değişmedi: 297.965 Avro.

Co-Authored-By: Claude Opus 5 <noreply@anthropic.com>
Claude-Session: https://claude.ai/code/session_01HJPp6bx7wepUX5p8fxGcjg
</commit_message>
<xml_diff>
--- a/belgeler/08_IPARD_EVRAK_LISTESI.docx
+++ b/belgeler/08_IPARD_EVRAK_LISTESI.docx
@@ -913,7 +913,7 @@
                 <w:color w:val="000000"/>
                 <w:sz w:val="16"/>
               </w:rPr>
-              <w:t xml:space="preserve">; hibeye konu tutar her zaman KDV hariç tutardır. Müstahsil olarak KDV mükellefi olmadığınız için bu KDV'yi indirim yoluyla geri de alamazsınız — tamamı cepten çıkar. Banka niyet mektubunun (A10) kapsaması gereken tutar budur: ·  · Yapım işleri (KDV hariç) · 15.720.192,50 TL · Makine ve ekipman (KDV hariç) · 3.784.288,46 TL · </w:t>
+              <w:t xml:space="preserve">; hibeye konu tutar her zaman KDV hariç tutardır. Müstahsil olarak KDV mükellefi olmadığınız için bu KDV'yi indirim yoluyla geri de alamazsınız — tamamı cepten çıkar. Banka niyet mektubunun (A10) kapsaması gereken tutar budur: ·  · Yapım işleri (KDV hariç) · 15.720.192,50 TL · Makine ve ekipman (KDV hariç) · 3.784.288,48 TL · </w:t>
             </w:r>
             <w:r>
               <w:rPr>
@@ -943,7 +943,7 @@
                 <w:color w:val="000000"/>
                 <w:sz w:val="16"/>
               </w:rPr>
-              <w:t>19.504.480,96 TL</w:t>
+              <w:t>19.504.480,98 TL</w:t>
             </w:r>
             <w:r>
               <w:rPr>
@@ -953,7 +953,7 @@
                 <w:color w:val="000000"/>
                 <w:sz w:val="16"/>
               </w:rPr>
-              <w:t xml:space="preserve"> · KDV %20 — hibe dışı, tamamı öz kaynak · 3.900.896,19 TL · </w:t>
+              <w:t xml:space="preserve"> · KDV %20 — hibe dışı, tamamı öz kaynak · 3.900.896,20 TL · </w:t>
             </w:r>
             <w:r>
               <w:rPr>
@@ -983,7 +983,7 @@
                 <w:color w:val="000000"/>
                 <w:sz w:val="16"/>
               </w:rPr>
-              <w:t>23.405.377,15 TL</w:t>
+              <w:t>23.405.377,18 TL</w:t>
             </w:r>
           </w:p>
         </w:tc>

</xml_diff>

<commit_message>
Yayın: temel metrajı temel projesinin son hâline göre yeniden kuruldu (TEMEL-PROJESI-SON-HAL)
T1 boyuna temel (aks 4, 78,55 m), T2…T22 enine temeller (aks 1-3, 9,75 m),
BK1…BK60 ve BK61…BK81 bağ kirişleri, S101…S121 betonarme kolonlar.
Miktarlar korundu; keşif özeti ve teklif belgelerinin metni değişmedi.

Co-Authored-By: Claude Opus 5 <noreply@anthropic.com>
Claude-Session: https://claude.ai/code/session_01HJPp6bx7wepUX5p8fxGcjg
</commit_message>
<xml_diff>
--- a/belgeler/08_IPARD_EVRAK_LISTESI.docx
+++ b/belgeler/08_IPARD_EVRAK_LISTESI.docx
@@ -4286,7 +4286,7 @@
                 <w:color w:val="000000"/>
                 <w:sz w:val="16"/>
               </w:rPr>
-              <w:t>Detaylı metraj cetveli · 03_METRAJ_CETVELI.pdf — yapı bazında, 146 ölçü satırı.</w:t>
+              <w:t>Detaylı metraj cetveli · 03_METRAJ_CETVELI.pdf — yapı bazında, 155 ölçü satırı.</w:t>
             </w:r>
           </w:p>
         </w:tc>
@@ -4701,7 +4701,7 @@
                 <w:color w:val="000000"/>
                 <w:sz w:val="16"/>
               </w:rPr>
-              <w:t>Yaklaşık maliyet cetveli · 85 kalem, 146 ölçü satırı; bağımsız doğrulayıcıdan sapmasız geçiyor.</w:t>
+              <w:t>Yaklaşık maliyet cetveli · 85 kalem, 155 ölçü satırı; bağımsız doğrulayıcıdan sapmasız geçiyor.</w:t>
             </w:r>
           </w:p>
         </w:tc>

</xml_diff>